<commit_message>
Lecture 13, commit 2
</commit_message>
<xml_diff>
--- a/Laboratory_13.docx
+++ b/Laboratory_13.docx
@@ -38,8 +38,6 @@
         </w:rPr>
         <w:t>13</w:t>
       </w:r>
-      <w:bookmarkStart w:id="1" w:name="_GoBack"/>
-      <w:bookmarkEnd w:id="1"/>
     </w:p>
     <w:p>
       <w:pPr>
@@ -971,15 +969,424 @@
     </w:p>
     <w:p>
       <w:pPr>
-        <w:tabs>
-          <w:tab w:val="left" w:pos="400"/>
-        </w:tabs>
-        <w:spacing w:line="0" w:lineRule="atLeast"/>
-        <w:rPr>
-          <w:rFonts w:ascii="Sylfaen" w:eastAsia="Sylfaen" w:hAnsi="Sylfaen"/>
-          <w:sz w:val="22"/>
-        </w:rPr>
-      </w:pPr>
+        <w:rPr>
+          <w:rFonts w:ascii="Sylfaen" w:eastAsia="Sylfaen" w:hAnsi="Sylfaen"/>
+          <w:sz w:val="22"/>
+        </w:rPr>
+      </w:pPr>
+      <w:r>
+        <w:rPr>
+          <w:rFonts w:ascii="Sylfaen" w:eastAsia="Sylfaen" w:hAnsi="Sylfaen"/>
+          <w:sz w:val="22"/>
+        </w:rPr>
+        <w:br w:type="page"/>
+      </w:r>
+    </w:p>
+    <w:p>
+      <w:pPr>
+        <w:pStyle w:val="ListParagraph"/>
+        <w:numPr>
+          <w:ilvl w:val="0"/>
+          <w:numId w:val="8"/>
+        </w:numPr>
+        <w:tabs>
+          <w:tab w:val="left" w:pos="400"/>
+        </w:tabs>
+        <w:spacing w:line="0" w:lineRule="atLeast"/>
+        <w:rPr>
+          <w:rFonts w:ascii="Sylfaen" w:eastAsia="Sylfaen" w:hAnsi="Sylfaen"/>
+          <w:sz w:val="22"/>
+          <w:lang w:val="en-US"/>
+        </w:rPr>
+      </w:pPr>
+      <w:r>
+        <w:rPr>
+          <w:rFonts w:ascii="Sylfaen" w:eastAsia="Sylfaen" w:hAnsi="Sylfaen"/>
+          <w:sz w:val="22"/>
+        </w:rPr>
+        <w:lastRenderedPageBreak/>
+        <w:t>ააგეთ</w:t>
+      </w:r>
+    </w:p>
+    <w:p>
+      <w:pPr>
+        <w:pStyle w:val="ListParagraph"/>
+        <w:tabs>
+          <w:tab w:val="left" w:pos="400"/>
+        </w:tabs>
+        <w:spacing w:line="0" w:lineRule="atLeast"/>
+        <w:rPr>
+          <w:rFonts w:ascii="Sylfaen" w:eastAsia="Sylfaen" w:hAnsi="Sylfaen"/>
+          <w:sz w:val="22"/>
+          <w:lang w:val="en-US"/>
+        </w:rPr>
+      </w:pPr>
+    </w:p>
+    <w:p>
+      <w:pPr>
+        <w:pStyle w:val="ListParagraph"/>
+        <w:tabs>
+          <w:tab w:val="left" w:pos="400"/>
+        </w:tabs>
+        <w:spacing w:line="0" w:lineRule="atLeast"/>
+        <w:rPr>
+          <w:rFonts w:ascii="Sylfaen" w:eastAsia="Sylfaen" w:hAnsi="Sylfaen"/>
+          <w:sz w:val="22"/>
+          <w:lang w:val="en-US"/>
+        </w:rPr>
+      </w:pPr>
+      <w:r>
+        <w:rPr>
+          <w:noProof/>
+        </w:rPr>
+        <w:drawing>
+          <wp:inline distT="0" distB="0" distL="0" distR="0" wp14:anchorId="7501280B" wp14:editId="63564488">
+            <wp:extent cx="8610600" cy="4766310"/>
+            <wp:effectExtent l="0" t="0" r="0" b="0"/>
+            <wp:docPr id="1" name="Picture 1" descr="Handmade Web"/>
+            <wp:cNvGraphicFramePr>
+              <a:graphicFrameLocks xmlns:a="http://schemas.openxmlformats.org/drawingml/2006/main" noChangeAspect="1"/>
+            </wp:cNvGraphicFramePr>
+            <a:graphic xmlns:a="http://schemas.openxmlformats.org/drawingml/2006/main">
+              <a:graphicData uri="http://schemas.openxmlformats.org/drawingml/2006/picture">
+                <pic:pic xmlns:pic="http://schemas.openxmlformats.org/drawingml/2006/picture">
+                  <pic:nvPicPr>
+                    <pic:cNvPr id="0" name="Picture 1" descr="Handmade Web"/>
+                    <pic:cNvPicPr>
+                      <a:picLocks noChangeAspect="1" noChangeArrowheads="1"/>
+                    </pic:cNvPicPr>
+                  </pic:nvPicPr>
+                  <pic:blipFill>
+                    <a:blip r:embed="rId11" cstate="print">
+                      <a:extLst>
+                        <a:ext uri="{28A0092B-C50C-407E-A947-70E740481C1C}">
+                          <a14:useLocalDpi xmlns:a14="http://schemas.microsoft.com/office/drawing/2010/main" val="0"/>
+                        </a:ext>
+                      </a:extLst>
+                    </a:blip>
+                    <a:srcRect/>
+                    <a:stretch>
+                      <a:fillRect/>
+                    </a:stretch>
+                  </pic:blipFill>
+                  <pic:spPr bwMode="auto">
+                    <a:xfrm>
+                      <a:off x="0" y="0"/>
+                      <a:ext cx="8610600" cy="4766310"/>
+                    </a:xfrm>
+                    <a:prstGeom prst="rect">
+                      <a:avLst/>
+                    </a:prstGeom>
+                    <a:noFill/>
+                    <a:ln>
+                      <a:noFill/>
+                    </a:ln>
+                  </pic:spPr>
+                </pic:pic>
+              </a:graphicData>
+            </a:graphic>
+          </wp:inline>
+        </w:drawing>
+      </w:r>
+    </w:p>
+    <w:p>
+      <w:pPr>
+        <w:rPr>
+          <w:rFonts w:ascii="Sylfaen" w:eastAsia="Sylfaen" w:hAnsi="Sylfaen"/>
+          <w:sz w:val="22"/>
+          <w:lang w:val="en-US"/>
+        </w:rPr>
+      </w:pPr>
+      <w:r>
+        <w:rPr>
+          <w:rFonts w:ascii="Sylfaen" w:eastAsia="Sylfaen" w:hAnsi="Sylfaen"/>
+          <w:sz w:val="22"/>
+          <w:lang w:val="en-US"/>
+        </w:rPr>
+        <w:br w:type="page"/>
+      </w:r>
+    </w:p>
+    <w:p>
+      <w:pPr>
+        <w:pStyle w:val="ListParagraph"/>
+        <w:numPr>
+          <w:ilvl w:val="0"/>
+          <w:numId w:val="8"/>
+        </w:numPr>
+        <w:tabs>
+          <w:tab w:val="left" w:pos="400"/>
+        </w:tabs>
+        <w:spacing w:line="0" w:lineRule="atLeast"/>
+        <w:rPr>
+          <w:rFonts w:ascii="Sylfaen" w:eastAsia="Sylfaen" w:hAnsi="Sylfaen"/>
+          <w:sz w:val="22"/>
+        </w:rPr>
+      </w:pPr>
+      <w:r>
+        <w:rPr>
+          <w:rFonts w:ascii="Sylfaen" w:eastAsia="Sylfaen" w:hAnsi="Sylfaen"/>
+          <w:sz w:val="22"/>
+        </w:rPr>
+        <w:lastRenderedPageBreak/>
+        <w:t>ააგეთ</w:t>
+      </w:r>
+    </w:p>
+    <w:p>
+      <w:pPr>
+        <w:pStyle w:val="ListParagraph"/>
+        <w:tabs>
+          <w:tab w:val="left" w:pos="400"/>
+        </w:tabs>
+        <w:spacing w:line="0" w:lineRule="atLeast"/>
+        <w:rPr>
+          <w:rFonts w:ascii="Sylfaen" w:eastAsia="Sylfaen" w:hAnsi="Sylfaen"/>
+          <w:sz w:val="22"/>
+        </w:rPr>
+      </w:pPr>
+    </w:p>
+    <w:p>
+      <w:pPr>
+        <w:pStyle w:val="ListParagraph"/>
+        <w:tabs>
+          <w:tab w:val="left" w:pos="400"/>
+        </w:tabs>
+        <w:spacing w:line="0" w:lineRule="atLeast"/>
+        <w:rPr>
+          <w:rFonts w:ascii="Sylfaen" w:eastAsia="Sylfaen" w:hAnsi="Sylfaen"/>
+          <w:sz w:val="22"/>
+        </w:rPr>
+      </w:pPr>
+      <w:r>
+        <w:rPr>
+          <w:noProof/>
+        </w:rPr>
+        <w:drawing>
+          <wp:inline distT="0" distB="0" distL="0" distR="0" wp14:anchorId="7C5ACB97" wp14:editId="28B8CE30">
+            <wp:extent cx="6959600" cy="4191000"/>
+            <wp:effectExtent l="0" t="0" r="0" b="0"/>
+            <wp:docPr id="3" name="Picture 3" descr="Introduction to Flexbox | The Odin Project"/>
+            <wp:cNvGraphicFramePr>
+              <a:graphicFrameLocks xmlns:a="http://schemas.openxmlformats.org/drawingml/2006/main" noChangeAspect="1"/>
+            </wp:cNvGraphicFramePr>
+            <a:graphic xmlns:a="http://schemas.openxmlformats.org/drawingml/2006/main">
+              <a:graphicData uri="http://schemas.openxmlformats.org/drawingml/2006/picture">
+                <pic:pic xmlns:pic="http://schemas.openxmlformats.org/drawingml/2006/picture">
+                  <pic:nvPicPr>
+                    <pic:cNvPr id="0" name="Picture 3" descr="Introduction to Flexbox | The Odin Project"/>
+                    <pic:cNvPicPr>
+                      <a:picLocks noChangeAspect="1" noChangeArrowheads="1"/>
+                    </pic:cNvPicPr>
+                  </pic:nvPicPr>
+                  <pic:blipFill>
+                    <a:blip r:embed="rId12">
+                      <a:extLst>
+                        <a:ext uri="{28A0092B-C50C-407E-A947-70E740481C1C}">
+                          <a14:useLocalDpi xmlns:a14="http://schemas.microsoft.com/office/drawing/2010/main" val="0"/>
+                        </a:ext>
+                      </a:extLst>
+                    </a:blip>
+                    <a:srcRect/>
+                    <a:stretch>
+                      <a:fillRect/>
+                    </a:stretch>
+                  </pic:blipFill>
+                  <pic:spPr bwMode="auto">
+                    <a:xfrm>
+                      <a:off x="0" y="0"/>
+                      <a:ext cx="6959600" cy="4191000"/>
+                    </a:xfrm>
+                    <a:prstGeom prst="rect">
+                      <a:avLst/>
+                    </a:prstGeom>
+                    <a:noFill/>
+                    <a:ln>
+                      <a:noFill/>
+                    </a:ln>
+                  </pic:spPr>
+                </pic:pic>
+              </a:graphicData>
+            </a:graphic>
+          </wp:inline>
+        </w:drawing>
+      </w:r>
+    </w:p>
+    <w:p>
+      <w:pPr>
+        <w:rPr>
+          <w:rFonts w:ascii="Sylfaen" w:eastAsia="Sylfaen" w:hAnsi="Sylfaen"/>
+          <w:sz w:val="22"/>
+        </w:rPr>
+      </w:pPr>
+      <w:r>
+        <w:rPr>
+          <w:rFonts w:ascii="Sylfaen" w:eastAsia="Sylfaen" w:hAnsi="Sylfaen"/>
+          <w:sz w:val="22"/>
+        </w:rPr>
+        <w:br w:type="page"/>
+      </w:r>
+    </w:p>
+    <w:p>
+      <w:pPr>
+        <w:pStyle w:val="ListParagraph"/>
+        <w:numPr>
+          <w:ilvl w:val="0"/>
+          <w:numId w:val="8"/>
+        </w:numPr>
+        <w:tabs>
+          <w:tab w:val="left" w:pos="400"/>
+        </w:tabs>
+        <w:spacing w:line="0" w:lineRule="atLeast"/>
+        <w:rPr>
+          <w:rFonts w:ascii="Sylfaen" w:eastAsia="Sylfaen" w:hAnsi="Sylfaen"/>
+          <w:sz w:val="22"/>
+        </w:rPr>
+      </w:pPr>
+      <w:r>
+        <w:rPr>
+          <w:rFonts w:ascii="Sylfaen" w:eastAsia="Sylfaen" w:hAnsi="Sylfaen"/>
+          <w:sz w:val="22"/>
+        </w:rPr>
+        <w:lastRenderedPageBreak/>
+        <w:t>ააგეთ</w:t>
+      </w:r>
+    </w:p>
+    <w:p>
+      <w:pPr>
+        <w:pStyle w:val="ListParagraph"/>
+        <w:tabs>
+          <w:tab w:val="left" w:pos="400"/>
+        </w:tabs>
+        <w:spacing w:line="0" w:lineRule="atLeast"/>
+        <w:rPr>
+          <w:rFonts w:ascii="Sylfaen" w:eastAsia="Sylfaen" w:hAnsi="Sylfaen"/>
+          <w:sz w:val="22"/>
+        </w:rPr>
+      </w:pPr>
+    </w:p>
+    <w:p>
+      <w:pPr>
+        <w:pStyle w:val="ListParagraph"/>
+        <w:tabs>
+          <w:tab w:val="left" w:pos="400"/>
+        </w:tabs>
+        <w:spacing w:line="0" w:lineRule="atLeast"/>
+        <w:rPr>
+          <w:rFonts w:ascii="Sylfaen" w:eastAsia="Sylfaen" w:hAnsi="Sylfaen"/>
+          <w:sz w:val="22"/>
+          <w:lang w:val="en-US"/>
+        </w:rPr>
+      </w:pPr>
+      <w:r>
+        <w:rPr>
+          <w:rFonts w:ascii="Sylfaen" w:eastAsia="Sylfaen" w:hAnsi="Sylfaen"/>
+          <w:sz w:val="22"/>
+          <w:lang w:val="en-US"/>
+        </w:rPr>
+        <w:drawing>
+          <wp:inline distT="0" distB="0" distL="0" distR="0" wp14:anchorId="102F44A3" wp14:editId="0068CEA0">
+            <wp:extent cx="6087325" cy="2381582"/>
+            <wp:effectExtent l="0" t="0" r="8890" b="0"/>
+            <wp:docPr id="5" name="Picture 5"/>
+            <wp:cNvGraphicFramePr>
+              <a:graphicFrameLocks xmlns:a="http://schemas.openxmlformats.org/drawingml/2006/main" noChangeAspect="1"/>
+            </wp:cNvGraphicFramePr>
+            <a:graphic xmlns:a="http://schemas.openxmlformats.org/drawingml/2006/main">
+              <a:graphicData uri="http://schemas.openxmlformats.org/drawingml/2006/picture">
+                <pic:pic xmlns:pic="http://schemas.openxmlformats.org/drawingml/2006/picture">
+                  <pic:nvPicPr>
+                    <pic:cNvPr id="1" name=""/>
+                    <pic:cNvPicPr/>
+                  </pic:nvPicPr>
+                  <pic:blipFill>
+                    <a:blip r:embed="rId13"/>
+                    <a:stretch>
+                      <a:fillRect/>
+                    </a:stretch>
+                  </pic:blipFill>
+                  <pic:spPr>
+                    <a:xfrm>
+                      <a:off x="0" y="0"/>
+                      <a:ext cx="6087325" cy="2381582"/>
+                    </a:xfrm>
+                    <a:prstGeom prst="rect">
+                      <a:avLst/>
+                    </a:prstGeom>
+                  </pic:spPr>
+                </pic:pic>
+              </a:graphicData>
+            </a:graphic>
+          </wp:inline>
+        </w:drawing>
+      </w:r>
+    </w:p>
+    <w:p>
+      <w:pPr>
+        <w:pStyle w:val="ListParagraph"/>
+        <w:tabs>
+          <w:tab w:val="left" w:pos="400"/>
+        </w:tabs>
+        <w:spacing w:line="0" w:lineRule="atLeast"/>
+        <w:rPr>
+          <w:rFonts w:ascii="Sylfaen" w:eastAsia="Sylfaen" w:hAnsi="Sylfaen"/>
+          <w:sz w:val="22"/>
+          <w:lang w:val="en-US"/>
+        </w:rPr>
+      </w:pPr>
+    </w:p>
+    <w:p>
+      <w:pPr>
+        <w:pStyle w:val="ListParagraph"/>
+        <w:numPr>
+          <w:ilvl w:val="0"/>
+          <w:numId w:val="8"/>
+        </w:numPr>
+        <w:tabs>
+          <w:tab w:val="left" w:pos="400"/>
+        </w:tabs>
+        <w:spacing w:line="0" w:lineRule="atLeast"/>
+        <w:rPr>
+          <w:rFonts w:ascii="Sylfaen" w:eastAsia="Sylfaen" w:hAnsi="Sylfaen"/>
+          <w:sz w:val="22"/>
+        </w:rPr>
+      </w:pPr>
+      <w:r>
+        <w:rPr>
+          <w:rFonts w:ascii="Sylfaen" w:eastAsia="Sylfaen" w:hAnsi="Sylfaen"/>
+          <w:sz w:val="22"/>
+        </w:rPr>
+        <w:t>ააგეთ</w:t>
+      </w:r>
+    </w:p>
+    <w:p>
+      <w:pPr>
+        <w:tabs>
+          <w:tab w:val="left" w:pos="400"/>
+        </w:tabs>
+        <w:spacing w:line="0" w:lineRule="atLeast"/>
+        <w:rPr>
+          <w:rFonts w:ascii="Sylfaen" w:eastAsia="Sylfaen" w:hAnsi="Sylfaen"/>
+          <w:sz w:val="22"/>
+          <w:lang w:val="en-US"/>
+        </w:rPr>
+      </w:pPr>
+      <w:r>
+        <w:rPr>
+          <w:rFonts w:ascii="Sylfaen" w:eastAsia="Sylfaen" w:hAnsi="Sylfaen"/>
+          <w:sz w:val="22"/>
+          <w:lang w:val="en-US"/>
+        </w:rPr>
+        <w:tab/>
+      </w:r>
+      <w:r>
+        <w:rPr>
+          <w:rFonts w:ascii="Sylfaen" w:eastAsia="Sylfaen" w:hAnsi="Sylfaen"/>
+          <w:sz w:val="22"/>
+          <w:lang w:val="en-US"/>
+        </w:rPr>
+        <w:tab/>
+      </w:r>
+      <w:bookmarkStart w:id="1" w:name="_GoBack"/>
+      <w:bookmarkEnd w:id="1"/>
     </w:p>
     <w:sectPr>
       <w:pgSz w:w="15840" w:h="12240" w:orient="landscape"/>

</xml_diff>